<commit_message>
QR-Code, Website-Anbindung in Präsentation, Booklet und Merkblatt, druck_merkblatt, Projektplanung mit Website-Arbeitspaket
Co-Authored-By: Claude Sonnet 5.5 <noreply@anthropic.com>
Claude-Session: https://claude.ai/code/session_01FgB7we8XF2bWXv4nWDrzG8
</commit_message>
<xml_diff>
--- a/output/v2/projektskizze.docx
+++ b/output/v2/projektskizze.docx
@@ -241,7 +241,7 @@
           <w:color w:val="1A2238"/>
           <w:sz w:val="20"/>
         </w:rPr>
-        <w:t>Das Booklet soll 13 Seiten umfassen: kurze Kapitel in einfacher Sprache, ein Merkblatt für eine Seite, Aufgaben (Vertrags-Detektiv, IHK-Fälle, Wahr oder falsch) mit Erwartungshorizont, ein Mini-Quiz, Glossar und Quellenverzeichnis. Die Praxisbeispiele sollen aus einem anonymisierten, eigenen Ausbildungsvertrag stammen.</w:t>
+        <w:t>Das Booklet soll 15 Seiten umfassen: kurze Kapitel in einfacher Sprache, ein Merkblatt für eine Seite, Aufgaben (Vertrags-Detektiv, IHK-Fälle, Wahr oder falsch) mit Erwartungshorizont, ein Mini-Quiz, Glossar und Quellenverzeichnis. Die Praxisbeispiele sollen aus einem anonymisierten, eigenen Ausbildungsvertrag stammen.</w:t>
       </w:r>
     </w:p>
     <w:p>
@@ -256,7 +256,7 @@
           <w:color w:val="1A2238"/>
           <w:sz w:val="20"/>
         </w:rPr>
-        <w:t>In der Unterrichtsstunde (bis zu 45 Minuten) stellen wir das Projekt kurz vor und üben danach mit der Klasse in zwei Aktivitäten: Rote/Grüne Karte und Vertrags-Detektiv. Dazu schreiben wir einen Projektbericht.</w:t>
+        <w:t>In der Unterrichtsstunde (bis zu 45 Minuten) stellen wir das Projekt kurz vor und üben danach mit der Klasse in zwei Aktivitäten: Rote/Grüne Karte und Vertrags-Detektiv. Die Klasse macht die Aktivitäten auf dem eigenen Handy über eine kleine interaktive Website, die sie per QR-Code öffnet; gedruckt wird nur das Merkblatt. Dazu schreiben wir einen Projektbericht.</w:t>
       </w:r>
     </w:p>
     <w:p>
@@ -977,7 +977,7 @@
                 <w:color w:val="1A2238"/>
                 <w:sz w:val="19"/>
               </w:rPr>
-              <w:t>Booklet mit Kapiteln, Merkblatt und Mini-Quiz erstellen; Aufgaben mit Erwartungshorizont erstellen</w:t>
+              <w:t>Booklet mit Kapiteln, Merkblatt und Mini-Quiz erstellen; Aufgaben mit Erwartungshorizont erstellen; Interaktive Website mit QR-Code</w:t>
             </w:r>
           </w:p>
         </w:tc>
@@ -1010,7 +1010,7 @@
                 <w:color w:val="1A2238"/>
                 <w:sz w:val="19"/>
               </w:rPr>
-              <w:t>5–6</w:t>
+              <w:t>5–7</w:t>
             </w:r>
           </w:p>
         </w:tc>
@@ -1147,7 +1147,7 @@
                 <w:color w:val="1A2238"/>
                 <w:sz w:val="19"/>
               </w:rPr>
-              <w:t>7–10</w:t>
+              <w:t>8–11</w:t>
             </w:r>
           </w:p>
         </w:tc>
@@ -1690,7 +1690,7 @@
                 <w:color w:val="1A2238"/>
                 <w:sz w:val="19"/>
               </w:rPr>
-              <w:t>Umsetzung: Booklet, Aufgaben, Präsentation, Material und Probelauf, Projektbericht</w:t>
+              <w:t>Umsetzung: Booklet, Aufgaben, Website, Präsentation, Material und Probelauf, Projektbericht</w:t>
             </w:r>
           </w:p>
         </w:tc>
@@ -1723,7 +1723,7 @@
                 <w:color w:val="1A2238"/>
                 <w:sz w:val="19"/>
               </w:rPr>
-              <w:t>5–9</w:t>
+              <w:t>5–10</w:t>
             </w:r>
           </w:p>
         </w:tc>
@@ -1827,7 +1827,7 @@
                 <w:color w:val="1A2238"/>
                 <w:sz w:val="19"/>
               </w:rPr>
-              <w:t>10</w:t>
+              <w:t>11</w:t>
             </w:r>
           </w:p>
         </w:tc>

</xml_diff>